<commit_message>
bổ sung chỉnh sửa report
</commit_message>
<xml_diff>
--- a/report/231A010689_NguyenQuocKiet_DeTai34_TieuLuan_CuoiKy.docx
+++ b/report/231A010689_NguyenQuocKiet_DeTai34_TieuLuan_CuoiKy.docx
@@ -567,6 +567,106 @@
                 <w:sz w:val="28"/>
                 <w:szCs w:val="28"/>
               </w:rPr>
+              <w:t>Mã đề tài</w:t>
+            </w:r>
+          </w:p>
+        </w:tc>
+        <w:tc>
+          <w:tcPr>
+            <w:tcW w:w="6375" w:type="dxa"/>
+          </w:tcPr>
+          <w:p>
+            <w:pPr>
+              <w:pStyle w:val="Ba"/>
+              <w:ind w:firstLine="0"/>
+              <w:rPr>
+                <w:bCs/>
+                <w:sz w:val="28"/>
+                <w:szCs w:val="28"/>
+              </w:rPr>
+            </w:pPr>
+            <w:r>
+              <w:rPr>
+                <w:bCs/>
+                <w:sz w:val="28"/>
+                <w:szCs w:val="28"/>
+              </w:rPr>
+              <w:t>34</w:t>
+            </w:r>
+          </w:p>
+        </w:tc>
+      </w:tr>
+      <w:tr>
+        <w:tc>
+          <w:tcPr>
+            <w:tcW w:w="3256" w:type="dxa"/>
+          </w:tcPr>
+          <w:p>
+            <w:pPr>
+              <w:pStyle w:val="Ba"/>
+              <w:ind w:firstLine="0"/>
+              <w:rPr>
+                <w:bCs/>
+                <w:sz w:val="28"/>
+                <w:szCs w:val="28"/>
+              </w:rPr>
+            </w:pPr>
+            <w:r>
+              <w:rPr>
+                <w:bCs/>
+                <w:sz w:val="28"/>
+                <w:szCs w:val="28"/>
+              </w:rPr>
+              <w:t xml:space="preserve">Hường đề tài </w:t>
+            </w:r>
+          </w:p>
+        </w:tc>
+        <w:tc>
+          <w:tcPr>
+            <w:tcW w:w="6375" w:type="dxa"/>
+          </w:tcPr>
+          <w:p>
+            <w:pPr>
+              <w:pStyle w:val="Ba"/>
+              <w:ind w:firstLine="0"/>
+              <w:rPr>
+                <w:bCs/>
+                <w:sz w:val="28"/>
+                <w:szCs w:val="28"/>
+              </w:rPr>
+            </w:pPr>
+            <w:r>
+              <w:rPr>
+                <w:bCs/>
+                <w:sz w:val="28"/>
+                <w:szCs w:val="28"/>
+              </w:rPr>
+              <w:t>E</w:t>
+            </w:r>
+          </w:p>
+        </w:tc>
+      </w:tr>
+      <w:tr>
+        <w:tc>
+          <w:tcPr>
+            <w:tcW w:w="3256" w:type="dxa"/>
+          </w:tcPr>
+          <w:p>
+            <w:pPr>
+              <w:pStyle w:val="Ba"/>
+              <w:ind w:firstLine="0"/>
+              <w:rPr>
+                <w:bCs/>
+                <w:sz w:val="28"/>
+                <w:szCs w:val="28"/>
+              </w:rPr>
+            </w:pPr>
+            <w:r>
+              <w:rPr>
+                <w:bCs/>
+                <w:sz w:val="28"/>
+                <w:szCs w:val="28"/>
+              </w:rPr>
               <w:t>Link repo GitHub</w:t>
             </w:r>
           </w:p>
@@ -667,32 +767,6 @@
         <w:rPr>
           <w:bCs/>
           <w:sz w:val="30"/>
-        </w:rPr>
-      </w:pPr>
-    </w:p>
-    <w:p>
-      <w:pPr>
-        <w:pStyle w:val="Ba"/>
-        <w:ind w:firstLine="0"/>
-        <w:jc w:val="both"/>
-        <w:rPr>
-          <w:bCs/>
-          <w:i/>
-          <w:sz w:val="28"/>
-          <w:szCs w:val="20"/>
-        </w:rPr>
-      </w:pPr>
-    </w:p>
-    <w:p>
-      <w:pPr>
-        <w:pStyle w:val="Ba"/>
-        <w:ind w:firstLine="0"/>
-        <w:jc w:val="both"/>
-        <w:rPr>
-          <w:bCs/>
-          <w:i/>
-          <w:sz w:val="28"/>
-          <w:szCs w:val="20"/>
         </w:rPr>
       </w:pPr>
     </w:p>
@@ -1349,6 +1423,106 @@
                 <w:sz w:val="28"/>
                 <w:szCs w:val="28"/>
               </w:rPr>
+              <w:t>Mã đề tài</w:t>
+            </w:r>
+          </w:p>
+        </w:tc>
+        <w:tc>
+          <w:tcPr>
+            <w:tcW w:w="6375" w:type="dxa"/>
+          </w:tcPr>
+          <w:p>
+            <w:pPr>
+              <w:pStyle w:val="Ba"/>
+              <w:ind w:firstLine="0"/>
+              <w:rPr>
+                <w:bCs/>
+                <w:sz w:val="28"/>
+                <w:szCs w:val="28"/>
+              </w:rPr>
+            </w:pPr>
+            <w:r>
+              <w:rPr>
+                <w:bCs/>
+                <w:sz w:val="28"/>
+                <w:szCs w:val="28"/>
+              </w:rPr>
+              <w:t>34</w:t>
+            </w:r>
+          </w:p>
+        </w:tc>
+      </w:tr>
+      <w:tr>
+        <w:tc>
+          <w:tcPr>
+            <w:tcW w:w="3256" w:type="dxa"/>
+          </w:tcPr>
+          <w:p>
+            <w:pPr>
+              <w:pStyle w:val="Ba"/>
+              <w:ind w:firstLine="0"/>
+              <w:rPr>
+                <w:bCs/>
+                <w:sz w:val="28"/>
+                <w:szCs w:val="28"/>
+              </w:rPr>
+            </w:pPr>
+            <w:r>
+              <w:rPr>
+                <w:bCs/>
+                <w:sz w:val="28"/>
+                <w:szCs w:val="28"/>
+              </w:rPr>
+              <w:t xml:space="preserve">Hường đề tài </w:t>
+            </w:r>
+          </w:p>
+        </w:tc>
+        <w:tc>
+          <w:tcPr>
+            <w:tcW w:w="6375" w:type="dxa"/>
+          </w:tcPr>
+          <w:p>
+            <w:pPr>
+              <w:pStyle w:val="Ba"/>
+              <w:ind w:firstLine="0"/>
+              <w:rPr>
+                <w:bCs/>
+                <w:sz w:val="28"/>
+                <w:szCs w:val="28"/>
+              </w:rPr>
+            </w:pPr>
+            <w:r>
+              <w:rPr>
+                <w:bCs/>
+                <w:sz w:val="28"/>
+                <w:szCs w:val="28"/>
+              </w:rPr>
+              <w:t>E</w:t>
+            </w:r>
+          </w:p>
+        </w:tc>
+      </w:tr>
+      <w:tr>
+        <w:tc>
+          <w:tcPr>
+            <w:tcW w:w="3256" w:type="dxa"/>
+          </w:tcPr>
+          <w:p>
+            <w:pPr>
+              <w:pStyle w:val="Ba"/>
+              <w:ind w:firstLine="0"/>
+              <w:rPr>
+                <w:bCs/>
+                <w:sz w:val="28"/>
+                <w:szCs w:val="28"/>
+              </w:rPr>
+            </w:pPr>
+            <w:r>
+              <w:rPr>
+                <w:bCs/>
+                <w:sz w:val="28"/>
+                <w:szCs w:val="28"/>
+              </w:rPr>
               <w:t>Link repo GitHub</w:t>
             </w:r>
           </w:p>
@@ -1439,30 +1613,6 @@
           <w:bCs/>
           <w:sz w:val="24"/>
           <w:u w:val="single"/>
-        </w:rPr>
-      </w:pPr>
-    </w:p>
-    <w:p>
-      <w:pPr>
-        <w:pStyle w:val="Ba"/>
-        <w:jc w:val="both"/>
-        <w:rPr>
-          <w:bCs/>
-          <w:sz w:val="24"/>
-          <w:u w:val="single"/>
-        </w:rPr>
-      </w:pPr>
-    </w:p>
-    <w:p>
-      <w:pPr>
-        <w:pStyle w:val="Ba"/>
-        <w:ind w:firstLine="0"/>
-        <w:jc w:val="both"/>
-        <w:rPr>
-          <w:bCs/>
-          <w:i/>
-          <w:sz w:val="28"/>
-          <w:szCs w:val="20"/>
         </w:rPr>
       </w:pPr>
     </w:p>
@@ -16349,10 +16499,7 @@
               <w:t xml:space="preserve">src/node-red-flow.json, </w:t>
             </w:r>
             <w:r>
-              <w:t>results</w:t>
-            </w:r>
-            <w:r>
-              <w:t xml:space="preserve"> </w:t>
+              <w:t xml:space="preserve">results </w:t>
             </w:r>
             <w:r>
               <w:t>/node-red.png</w:t>
@@ -18655,13 +18802,7 @@
       </w:pPr>
       <w:bookmarkStart w:id="58" w:name="_Toc236053416"/>
       <w:r>
-        <w:t xml:space="preserve">Hình </w:t>
-      </w:r>
-      <w:r>
-        <w:t>4</w:t>
-      </w:r>
-      <w:r>
-        <w:t xml:space="preserve">.1. </w:t>
+        <w:t xml:space="preserve">Hình 4.1. </w:t>
       </w:r>
       <w:r>
         <w:t>Môi trường thực nghiệm hệ thống trên VMware Workstation</w:t>
@@ -18726,13 +18867,7 @@
       </w:pPr>
       <w:bookmarkStart w:id="59" w:name="_Toc236053417"/>
       <w:r>
-        <w:t xml:space="preserve">Hình </w:t>
-      </w:r>
-      <w:r>
-        <w:t>4</w:t>
-      </w:r>
-      <w:r>
-        <w:t xml:space="preserve">.2. </w:t>
+        <w:t xml:space="preserve">Hình 4.2. </w:t>
       </w:r>
       <w:r>
         <w:t>Windows Client kiểm tra kết nối đến pfSense và Kali Linux</w:t>
@@ -18793,13 +18928,7 @@
       </w:pPr>
       <w:bookmarkStart w:id="60" w:name="_Toc236053418"/>
       <w:r>
-        <w:t xml:space="preserve">Hình </w:t>
-      </w:r>
-      <w:r>
-        <w:t>4</w:t>
-      </w:r>
-      <w:r>
-        <w:t xml:space="preserve">.3. </w:t>
+        <w:t xml:space="preserve">Hình 4.3. </w:t>
       </w:r>
       <w:r>
         <w:t>Kali Linux kiểm tra kết nối đến pfSense và Windows Client</w:t>
@@ -18870,13 +18999,7 @@
       <w:bookmarkStart w:id="61" w:name="_Toc236053419"/>
       <w:r>
         <w:lastRenderedPageBreak/>
-        <w:t xml:space="preserve">Hình </w:t>
-      </w:r>
-      <w:r>
-        <w:t>4</w:t>
-      </w:r>
-      <w:r>
-        <w:t>.4. Đăng nhập WebConfigurator của pfSense</w:t>
+        <w:t>Hình 4.4. Đăng nhập WebConfigurator của pfSense</w:t>
       </w:r>
       <w:bookmarkEnd w:id="61"/>
     </w:p>
@@ -18933,13 +19056,7 @@
       </w:pPr>
       <w:bookmarkStart w:id="62" w:name="_Toc236053420"/>
       <w:r>
-        <w:t xml:space="preserve">Hình </w:t>
-      </w:r>
-      <w:r>
-        <w:t>4</w:t>
-      </w:r>
-      <w:r>
-        <w:t>.5. Giao diện WebConfigurator pfSense</w:t>
+        <w:t>Hình 4.5. Giao diện WebConfigurator pfSense</w:t>
       </w:r>
       <w:bookmarkEnd w:id="62"/>
     </w:p>
@@ -19002,13 +19119,7 @@
       </w:pPr>
       <w:bookmarkStart w:id="63" w:name="_Toc236053421"/>
       <w:r>
-        <w:t xml:space="preserve">Hình </w:t>
-      </w:r>
-      <w:r>
-        <w:t>4</w:t>
-      </w:r>
-      <w:r>
-        <w:t xml:space="preserve">.6. </w:t>
+        <w:t xml:space="preserve">Hình 4.6. </w:t>
       </w:r>
       <w:r>
         <w:t>Trình hướng dẫn thiết lập ban đầu của pfSense</w:t>
@@ -19063,13 +19174,7 @@
       </w:pPr>
       <w:bookmarkStart w:id="64" w:name="_Toc236053422"/>
       <w:r>
-        <w:t xml:space="preserve">Hình </w:t>
-      </w:r>
-      <w:r>
-        <w:t>4</w:t>
-      </w:r>
-      <w:r>
-        <w:t>.7. Giao diện quản trị chính của pfSense</w:t>
+        <w:t>Hình 4.7. Giao diện quản trị chính của pfSense</w:t>
       </w:r>
       <w:bookmarkEnd w:id="64"/>
     </w:p>
@@ -19132,13 +19237,7 @@
       </w:pPr>
       <w:bookmarkStart w:id="65" w:name="_Toc236053423"/>
       <w:r>
-        <w:t xml:space="preserve">Hình </w:t>
-      </w:r>
-      <w:r>
-        <w:t>4</w:t>
-      </w:r>
-      <w:r>
-        <w:t>.8. Cài đặt gói Suricata IDS trên pfSense</w:t>
+        <w:t>Hình 4.8. Cài đặt gói Suricata IDS trên pfSense</w:t>
       </w:r>
       <w:bookmarkEnd w:id="65"/>
     </w:p>
@@ -19190,13 +19289,7 @@
       </w:pPr>
       <w:bookmarkStart w:id="66" w:name="_Toc236053424"/>
       <w:r>
-        <w:t xml:space="preserve">Hình </w:t>
-      </w:r>
-      <w:r>
-        <w:t>4</w:t>
-      </w:r>
-      <w:r>
-        <w:t>.9. Giao diện của Suricata sau khi cài đặt thành công</w:t>
+        <w:t>Hình 4.9. Giao diện của Suricata sau khi cài đặt thành công</w:t>
       </w:r>
       <w:bookmarkEnd w:id="66"/>
     </w:p>
@@ -19254,13 +19347,7 @@
       </w:pPr>
       <w:bookmarkStart w:id="67" w:name="_Toc236053425"/>
       <w:r>
-        <w:t xml:space="preserve">Hình </w:t>
-      </w:r>
-      <w:r>
-        <w:t>4</w:t>
-      </w:r>
-      <w:r>
-        <w:t xml:space="preserve">.10. </w:t>
+        <w:t xml:space="preserve">Hình 4.10. </w:t>
       </w:r>
       <w:r>
         <w:t>Cấu hình bộ luật và cơ chế cập nhật của Suricata IDS</w:t>
@@ -19320,13 +19407,7 @@
       </w:pPr>
       <w:bookmarkStart w:id="68" w:name="_Toc236053426"/>
       <w:r>
-        <w:t xml:space="preserve">Hình </w:t>
-      </w:r>
-      <w:r>
-        <w:t>4</w:t>
-      </w:r>
-      <w:r>
-        <w:t xml:space="preserve">.11. </w:t>
+        <w:t xml:space="preserve">Hình 4.11. </w:t>
       </w:r>
       <w:r>
         <w:t>Cấu hình bộ luật và cơ chế cập nhật của Suricata IDS</w:t>
@@ -19392,13 +19473,7 @@
       </w:pPr>
       <w:bookmarkStart w:id="69" w:name="_Toc236053427"/>
       <w:r>
-        <w:t xml:space="preserve">Hình </w:t>
-      </w:r>
-      <w:r>
-        <w:t>4</w:t>
-      </w:r>
-      <w:r>
-        <w:t xml:space="preserve">.12. </w:t>
+        <w:t xml:space="preserve">Hình 4.12. </w:t>
       </w:r>
       <w:r>
         <w:t>Cập nhật bộ luật phát hiện xâm nhập của Suricata</w:t>
@@ -19464,13 +19539,7 @@
       <w:bookmarkStart w:id="70" w:name="_Toc236053428"/>
       <w:r>
         <w:lastRenderedPageBreak/>
-        <w:t xml:space="preserve">Hình </w:t>
-      </w:r>
-      <w:r>
-        <w:t>4</w:t>
-      </w:r>
-      <w:r>
-        <w:t xml:space="preserve">.13. </w:t>
+        <w:t xml:space="preserve">Hình 4.13. </w:t>
       </w:r>
       <w:r>
         <w:t>Thiết lập giao diện LAN cho Suricata</w:t>
@@ -19530,13 +19599,7 @@
       </w:pPr>
       <w:bookmarkStart w:id="71" w:name="_Toc236053429"/>
       <w:r>
-        <w:t xml:space="preserve">Hình </w:t>
-      </w:r>
-      <w:r>
-        <w:t>4</w:t>
-      </w:r>
-      <w:r>
-        <w:t>.14. Giao diện Interface Lan sau khi được thiết lập</w:t>
+        <w:t>Hình 4.14. Giao diện Interface Lan sau khi được thiết lập</w:t>
       </w:r>
       <w:bookmarkEnd w:id="71"/>
     </w:p>
@@ -19604,13 +19667,7 @@
       </w:pPr>
       <w:bookmarkStart w:id="72" w:name="_Toc236053430"/>
       <w:r>
-        <w:t xml:space="preserve">Hình </w:t>
-      </w:r>
-      <w:r>
-        <w:t>4</w:t>
-      </w:r>
-      <w:r>
-        <w:t>.15.Giao diện l</w:t>
+        <w:t>Hình 4.15.Giao diện l</w:t>
       </w:r>
       <w:r>
         <w:t>ựa chọn nhóm luật phát hiện xâm nhập cho Suricata</w:t>
@@ -19677,13 +19734,7 @@
       </w:pPr>
       <w:bookmarkStart w:id="73" w:name="_Toc236053431"/>
       <w:r>
-        <w:t xml:space="preserve">Hình </w:t>
-      </w:r>
-      <w:r>
-        <w:t>4</w:t>
-      </w:r>
-      <w:r>
-        <w:t xml:space="preserve">.16. </w:t>
+        <w:t xml:space="preserve">Hình 4.16. </w:t>
       </w:r>
       <w:r>
         <w:t>Lựa chọn các nhóm luật phát hiện xâm nhập của Suricata</w:t>
@@ -19743,13 +19794,7 @@
       </w:pPr>
       <w:bookmarkStart w:id="74" w:name="_Toc236053432"/>
       <w:r>
-        <w:t xml:space="preserve">Hình </w:t>
-      </w:r>
-      <w:r>
-        <w:t>4</w:t>
-      </w:r>
-      <w:r>
-        <w:t xml:space="preserve">.17. </w:t>
+        <w:t xml:space="preserve">Hình 4.17. </w:t>
       </w:r>
       <w:r>
         <w:t>Khởi động Suricata trên giao diện LAN</w:t>
@@ -19842,13 +19887,7 @@
       </w:pPr>
       <w:bookmarkStart w:id="78" w:name="_Toc236053433"/>
       <w:r>
-        <w:t xml:space="preserve">Hình </w:t>
-      </w:r>
-      <w:r>
-        <w:t>4</w:t>
-      </w:r>
-      <w:r>
-        <w:t>.18. Giao diện trang web Node.js</w:t>
+        <w:t>Hình 4.18. Giao diện trang web Node.js</w:t>
       </w:r>
       <w:bookmarkEnd w:id="78"/>
     </w:p>
@@ -19900,13 +19939,7 @@
       </w:pPr>
       <w:bookmarkStart w:id="79" w:name="_Toc236053434"/>
       <w:r>
-        <w:t xml:space="preserve">Hình </w:t>
-      </w:r>
-      <w:r>
-        <w:t>4</w:t>
-      </w:r>
-      <w:r>
-        <w:t xml:space="preserve">.19. </w:t>
+        <w:t xml:space="preserve">Hình 4.19. </w:t>
       </w:r>
       <w:r>
         <w:t>Kiểm tra môi trường Node.js trên Windows Client</w:t>
@@ -19967,13 +20000,7 @@
       </w:pPr>
       <w:bookmarkStart w:id="80" w:name="_Toc236053435"/>
       <w:r>
-        <w:t xml:space="preserve">Hình </w:t>
-      </w:r>
-      <w:r>
-        <w:t>4</w:t>
-      </w:r>
-      <w:r>
-        <w:t xml:space="preserve">.20. </w:t>
+        <w:t xml:space="preserve">Hình 4.20. </w:t>
       </w:r>
       <w:r>
         <w:t>Cài đặt Node-RED bằng npm</w:t>
@@ -20033,13 +20060,7 @@
       </w:pPr>
       <w:bookmarkStart w:id="81" w:name="_Toc236053436"/>
       <w:r>
-        <w:t xml:space="preserve">Hình </w:t>
-      </w:r>
-      <w:r>
-        <w:t>4</w:t>
-      </w:r>
-      <w:r>
-        <w:t xml:space="preserve">.21. </w:t>
+        <w:t xml:space="preserve">Hình 4.21. </w:t>
       </w:r>
       <w:r>
         <w:t>Khởi động dịch vụ Node-RED trên Windows Client</w:t>
@@ -20108,13 +20129,7 @@
       </w:pPr>
       <w:bookmarkStart w:id="82" w:name="_Toc236053437"/>
       <w:r>
-        <w:t xml:space="preserve">Hình </w:t>
-      </w:r>
-      <w:r>
-        <w:t>4</w:t>
-      </w:r>
-      <w:r>
-        <w:t xml:space="preserve">.22. </w:t>
+        <w:t xml:space="preserve">Hình 4.22. </w:t>
       </w:r>
       <w:r>
         <w:t>Giao diện quản lý Node-RED trên Windows Client</w:t>
@@ -20180,13 +20195,7 @@
       </w:pPr>
       <w:bookmarkStart w:id="83" w:name="_Toc236053438"/>
       <w:r>
-        <w:t xml:space="preserve">Hình </w:t>
-      </w:r>
-      <w:r>
-        <w:t>4</w:t>
-      </w:r>
-      <w:r>
-        <w:t xml:space="preserve">.23. </w:t>
+        <w:t xml:space="preserve">Hình 4.23. </w:t>
       </w:r>
       <w:r>
         <w:t>Cấu hình luồng mô phỏng dịch vụ cảm biến IoT trên Node-RED</w:t>
@@ -20254,13 +20263,7 @@
       </w:pPr>
       <w:bookmarkStart w:id="84" w:name="_Toc236053439"/>
       <w:r>
-        <w:t xml:space="preserve">Hình </w:t>
-      </w:r>
-      <w:r>
-        <w:t>4</w:t>
-      </w:r>
-      <w:r>
-        <w:t xml:space="preserve">.24. </w:t>
+        <w:t xml:space="preserve">Hình 4.24. </w:t>
       </w:r>
       <w:r>
         <w:t>Kiểm tra hoạt động của dịch vụ cảm biến IoT trên Node-RED</w:t>
@@ -20321,13 +20324,7 @@
       </w:pPr>
       <w:bookmarkStart w:id="85" w:name="_Toc236053440"/>
       <w:r>
-        <w:t xml:space="preserve">Hình </w:t>
-      </w:r>
-      <w:r>
-        <w:t>4</w:t>
-      </w:r>
-      <w:r>
-        <w:t xml:space="preserve">.25. </w:t>
+        <w:t xml:space="preserve">Hình 4.25. </w:t>
       </w:r>
       <w:r>
         <w:t>Kết quả truy cập dịch vụ cảm biến IoT từ máy Kali Linux</w:t>
@@ -20387,13 +20384,7 @@
       </w:pPr>
       <w:bookmarkStart w:id="86" w:name="_Toc236053441"/>
       <w:r>
-        <w:t xml:space="preserve">Hình </w:t>
-      </w:r>
-      <w:r>
-        <w:t>4</w:t>
-      </w:r>
-      <w:r>
-        <w:t xml:space="preserve">.26. </w:t>
+        <w:t xml:space="preserve">Hình 4.26. </w:t>
       </w:r>
       <w:r>
         <w:t>Tạo lưu lượng HTTP từ máy Kali Linux đến dịch vụ Node-RED</w:t>
@@ -20449,13 +20440,7 @@
       </w:pPr>
       <w:bookmarkStart w:id="87" w:name="_Toc236053442"/>
       <w:r>
-        <w:t xml:space="preserve">Hình </w:t>
-      </w:r>
-      <w:r>
-        <w:t>4</w:t>
-      </w:r>
-      <w:r>
-        <w:t xml:space="preserve">.27. </w:t>
+        <w:t xml:space="preserve">Hình 4.27. </w:t>
       </w:r>
       <w:r>
         <w:t>Kết quả quét cổng dịch vụ Node-RED bằng Nmap</w:t>
@@ -20526,13 +20511,7 @@
       </w:pPr>
       <w:bookmarkStart w:id="88" w:name="_Toc236053443"/>
       <w:r>
-        <w:t xml:space="preserve">Hình </w:t>
-      </w:r>
-      <w:r>
-        <w:t>4</w:t>
-      </w:r>
-      <w:r>
-        <w:t>.28. Giao diện trang cảnh báo</w:t>
+        <w:t>Hình 4.28. Giao diện trang cảnh báo</w:t>
       </w:r>
       <w:bookmarkEnd w:id="88"/>
     </w:p>
@@ -20589,13 +20568,7 @@
       </w:pPr>
       <w:bookmarkStart w:id="89" w:name="_Toc236053444"/>
       <w:r>
-        <w:t xml:space="preserve">Hình </w:t>
-      </w:r>
-      <w:r>
-        <w:t>4</w:t>
-      </w:r>
-      <w:r>
-        <w:t xml:space="preserve">.29. </w:t>
+        <w:t xml:space="preserve">Hình 4.29. </w:t>
       </w:r>
       <w:r>
         <w:t>Suricata IDS phát hiện hoạt động quét cổng từ máy Kali Linux</w:t>
@@ -24860,13 +24833,7 @@
         <w:rPr>
           <w:sz w:val="24"/>
         </w:rPr>
-        <w:t>Nghiên cứu kết hợp cơ chế phát hiện dựa trên chữ ký (Signature-based IDS) với các phương pháp phát hiện dựa trên hành vi hoặc học máy nhằm nâng cao khả năng nhận diện các mối đe dọa mới chưa có chữ ký.</w:t>
-      </w:r>
-      <w:r>
-        <w:rPr>
-          <w:sz w:val="24"/>
-        </w:rPr>
-        <w:t xml:space="preserve"> </w:t>
+        <w:t xml:space="preserve">Nghiên cứu kết hợp cơ chế phát hiện dựa trên chữ ký (Signature-based IDS) với các phương pháp phát hiện dựa trên hành vi hoặc học máy nhằm nâng cao khả năng nhận diện các mối đe dọa mới chưa có chữ ký. </w:t>
       </w:r>
       <w:r>
         <w:rPr>
@@ -26799,6 +26766,7 @@
   <w:style w:type="character" w:default="1" w:styleId="DefaultParagraphFont">
     <w:name w:val="Default Paragraph Font"/>
     <w:uiPriority w:val="1"/>
+    <w:semiHidden/>
     <w:unhideWhenUsed/>
   </w:style>
   <w:style w:type="table" w:default="1" w:styleId="TableNormal">

</xml_diff>